<commit_message>
updated the Threat Modeling - Model Creation Procedure tertiary document (blank pages in generated PDF)
</commit_message>
<xml_diff>
--- a/source/reference_documents/tertiary_documents/design/Threat Modeling/model creation/Threat Modeling - Model Creation.docx
+++ b/source/reference_documents/tertiary_documents/design/Threat Modeling/model creation/Threat Modeling - Model Creation.docx
@@ -41,7 +41,7 @@
         <w:t xml:space="preserve">Version </w:t>
       </w:r>
       <w:r>
-        <w:t>9</w:t>
+        <w:t>10</w:t>
       </w:r>
     </w:p>
     <w:p>
@@ -58,7 +58,7 @@
         <w:rPr>
           <w:noProof/>
         </w:rPr>
-        <w:t>4/27/26 12:32 PM</w:t>
+        <w:t>7/20/26 1:18 PM</w:t>
       </w:r>
       <w:r>
         <w:fldChar w:fldCharType="end"/>

</xml_diff>